<commit_message>
WDI2020 second pass new data
Corrected import of wrong data in first pass.
Filled out TEST with data from both WDI2018 and WDI2020 and checked one against the other
</commit_message>
<xml_diff>
--- a/CHANGE TRACKING/Progress Chase 10 October 2020.docx
+++ b/CHANGE TRACKING/Progress Chase 10 October 2020.docx
@@ -87,8 +87,30 @@
         <w:rPr>
           <w:lang w:val="en-CA"/>
         </w:rPr>
-        <w:t>the GDP hierarchy for GDP by Expenditure (Consumption, GFCF, Imports, Exports, Government) and for GDP Sectors.  Where BoP magnitudes are reported as part of GDP by Expenditure, nevertheless categories them as BoP</w:t>
-      </w:r>
+        <w:t xml:space="preserve">the GDP hierarchy for GDP by Expenditure (Consumption, GFCF, Imports, Exports, Government) and for GDP Sectors.  Where </w:t>
+      </w:r>
+      <w:proofErr w:type="spellStart"/>
+      <w:r>
+        <w:rPr>
+          <w:lang w:val="en-CA"/>
+        </w:rPr>
+        <w:t>BoP</w:t>
+      </w:r>
+      <w:proofErr w:type="spellEnd"/>
+      <w:r>
+        <w:rPr>
+          <w:lang w:val="en-CA"/>
+        </w:rPr>
+        <w:t xml:space="preserve"> magnitudes are reported as part of GDP by Expenditure, nevertheless categories them as </w:t>
+      </w:r>
+      <w:proofErr w:type="spellStart"/>
+      <w:r>
+        <w:rPr>
+          <w:lang w:val="en-CA"/>
+        </w:rPr>
+        <w:t>BoP</w:t>
+      </w:r>
+      <w:proofErr w:type="spellEnd"/>
     </w:p>
     <w:p>
       <w:pPr>
@@ -219,8 +241,33 @@
         </w:numPr>
       </w:pPr>
       <w:r>
-        <w:t>The 2015 dataset is different from 2018 but contains no additional entries. Discard it.</w:t>
-      </w:r>
+        <w:t>The 2015 dataset is different from 2018 but contains no additional entries.</w:t>
+      </w:r>
+    </w:p>
+    <w:p>
+      <w:pPr>
+        <w:pStyle w:val="ListParagraph"/>
+        <w:numPr>
+          <w:ilvl w:val="2"/>
+          <w:numId w:val="4"/>
+        </w:numPr>
+      </w:pPr>
+      <w:r>
+        <w:t xml:space="preserve">2020 add extra indicators to </w:t>
+      </w:r>
+      <w:proofErr w:type="spellStart"/>
+      <w:r>
+        <w:t>IndicatorStandardNames</w:t>
+      </w:r>
+      <w:proofErr w:type="spellEnd"/>
+      <w:r>
+        <w:t xml:space="preserve"> and </w:t>
+      </w:r>
+      <w:proofErr w:type="spellStart"/>
+      <w:r>
+        <w:t>DimIndicator</w:t>
+      </w:r>
+      <w:proofErr w:type="spellEnd"/>
     </w:p>
     <w:p>
       <w:pPr>
@@ -364,6 +411,7 @@
           <w:color w:val="000000"/>
           <w:lang w:eastAsia="en-CA"/>
         </w:rPr>
+        <w:lastRenderedPageBreak/>
         <w:t>Country Name, Country Code, Indicator Name, Indicator Code</w:t>
       </w:r>
     </w:p>
@@ -548,7 +596,7 @@
           </w:p>
           <w:p>
             <w:r>
-              <w:t>All existing WDI2018 indicators are the same as the WDI2020 indicators</w:t>
+              <w:t>WDI2020 incorrectly imports WDI2018 data</w:t>
             </w:r>
           </w:p>
         </w:tc>
@@ -558,31 +606,62 @@
           <w:tcPr>
             <w:tcW w:w="307" w:type="pct"/>
           </w:tcPr>
-          <w:p/>
+          <w:p>
+            <w:r>
+              <w:t>3a</w:t>
+            </w:r>
+          </w:p>
         </w:tc>
         <w:tc>
           <w:tcPr>
             <w:tcW w:w="569" w:type="pct"/>
           </w:tcPr>
-          <w:p/>
+          <w:p>
+            <w:r>
+              <w:t>11/10/2020</w:t>
+            </w:r>
+          </w:p>
         </w:tc>
         <w:tc>
           <w:tcPr>
             <w:tcW w:w="1749" w:type="pct"/>
           </w:tcPr>
-          <w:p/>
+          <w:p>
+            <w:r>
+              <w:t>WDI2020 correct failed import</w:t>
+            </w:r>
+          </w:p>
         </w:tc>
         <w:tc>
           <w:tcPr>
             <w:tcW w:w="1042" w:type="pct"/>
           </w:tcPr>
-          <w:p/>
+          <w:p>
+            <w:r>
+              <w:t xml:space="preserve">WDI2020 </w:t>
+            </w:r>
+            <w:r>
+              <w:t xml:space="preserve">second </w:t>
+            </w:r>
+            <w:r>
+              <w:t>pass new data</w:t>
+            </w:r>
+          </w:p>
         </w:tc>
         <w:tc>
           <w:tcPr>
             <w:tcW w:w="1333" w:type="pct"/>
           </w:tcPr>
-          <w:p/>
+          <w:p>
+            <w:r>
+              <w:t>TEST WDI2020 10.10.2020</w:t>
+            </w:r>
+          </w:p>
+          <w:p>
+            <w:r>
+              <w:t>Import now correct</w:t>
+            </w:r>
+          </w:p>
         </w:tc>
       </w:tr>
       <w:tr>
@@ -863,13 +942,7 @@
     <w:p/>
     <w:p/>
     <w:p/>
-    <w:p>
-      <w:pPr>
-        <w:rPr>
-          <w:lang w:val="en-GB"/>
-        </w:rPr>
-      </w:pPr>
-    </w:p>
+    <w:p/>
     <w:sectPr>
       <w:pgSz w:w="15840" w:h="12240" w:orient="landscape"/>
       <w:pgMar w:top="1440" w:right="1440" w:bottom="1440" w:left="1440" w:header="708" w:footer="708" w:gutter="0"/>

</xml_diff>

<commit_message>
WDI2020 new indicators incorporated
All new WDI2020 indicators added to Standardiser and to dimIndicator. However a complete overhaul of the industry Dimension is overdue, and the addition of these new indicators only makes the clearer.
</commit_message>
<xml_diff>
--- a/CHANGE TRACKING/Progress Chase 10 October 2020.docx
+++ b/CHANGE TRACKING/Progress Chase 10 October 2020.docx
@@ -669,31 +669,51 @@
           <w:tcPr>
             <w:tcW w:w="307" w:type="pct"/>
           </w:tcPr>
-          <w:p/>
+          <w:p>
+            <w:r>
+              <w:t>3a(iii)</w:t>
+            </w:r>
+          </w:p>
         </w:tc>
         <w:tc>
           <w:tcPr>
             <w:tcW w:w="569" w:type="pct"/>
           </w:tcPr>
-          <w:p/>
+          <w:p>
+            <w:r>
+              <w:t>11/10/2020</w:t>
+            </w:r>
+          </w:p>
         </w:tc>
         <w:tc>
           <w:tcPr>
             <w:tcW w:w="1749" w:type="pct"/>
           </w:tcPr>
-          <w:p/>
+          <w:p>
+            <w:r>
+              <w:t>Complete offline dataset produced, but now we need to overhaul the industry dimension</w:t>
+            </w:r>
+          </w:p>
         </w:tc>
         <w:tc>
           <w:tcPr>
             <w:tcW w:w="1042" w:type="pct"/>
           </w:tcPr>
-          <w:p/>
+          <w:p>
+            <w:r>
+              <w:t>WDI2020 new indicators incorporated</w:t>
+            </w:r>
+          </w:p>
         </w:tc>
         <w:tc>
           <w:tcPr>
             <w:tcW w:w="1333" w:type="pct"/>
           </w:tcPr>
-          <w:p/>
+          <w:p>
+            <w:r>
+              <w:t>Complete offline dataset produced</w:t>
+            </w:r>
+          </w:p>
         </w:tc>
       </w:tr>
       <w:tr>

</xml_diff>